<commit_message>
feat: board export {Board Type} {Board Name} like Main Switchboard MSB-01
</commit_message>
<xml_diff>
--- a/public/templates/Estimating Standard Tender Template (2026).docx
+++ b/public/templates/Estimating Standard Tender Template (2026).docx
@@ -540,36 +540,6 @@
                 <w:rFonts w:ascii="Arial" w:hAnsi="Arial" w:cs="Arial"/>
                 <w:sz w:val="20"/>
               </w:rPr>
-              <w:t>quoteNumber</w:t>
-            </w:r>
-            <w:proofErr w:type="spellEnd"/>
-            <w:r>
-              <w:rPr>
-                <w:rFonts w:ascii="Arial" w:hAnsi="Arial" w:cs="Arial"/>
-                <w:sz w:val="20"/>
-              </w:rPr>
-              <w:t>}</w:t>
-            </w:r>
-            <w:r>
-              <w:rPr>
-                <w:rFonts w:ascii="Arial" w:hAnsi="Arial" w:cs="Arial"/>
-                <w:sz w:val="20"/>
-              </w:rPr>
-              <w:t xml:space="preserve"> - </w:t>
-            </w:r>
-            <w:r>
-              <w:rPr>
-                <w:rFonts w:ascii="Arial" w:hAnsi="Arial" w:cs="Arial"/>
-                <w:sz w:val="20"/>
-              </w:rPr>
-              <w:t>{</w:t>
-            </w:r>
-            <w:proofErr w:type="spellStart"/>
-            <w:r>
-              <w:rPr>
-                <w:rFonts w:ascii="Arial" w:hAnsi="Arial" w:cs="Arial"/>
-                <w:sz w:val="20"/>
-              </w:rPr>
               <w:t>projectName</w:t>
             </w:r>
             <w:proofErr w:type="spellEnd"/>
@@ -754,23 +724,7 @@
                 <w:rFonts w:ascii="Arial" w:hAnsi="Arial" w:cs="Arial"/>
                 <w:sz w:val="20"/>
               </w:rPr>
-              <w:t>{#</w:t>
-            </w:r>
-            <w:proofErr w:type="gramStart"/>
-            <w:r>
-              <w:rPr>
-                <w:rFonts w:ascii="Arial" w:hAnsi="Arial" w:cs="Arial"/>
-                <w:sz w:val="20"/>
-              </w:rPr>
-              <w:t>boards}{</w:t>
-            </w:r>
-            <w:proofErr w:type="gramEnd"/>
-            <w:r>
-              <w:rPr>
-                <w:rFonts w:ascii="Arial" w:hAnsi="Arial" w:cs="Arial"/>
-                <w:sz w:val="20"/>
-              </w:rPr>
-              <w:t>itemNo}</w:t>
+              <w:t>{#boards}{itemNo}</w:t>
             </w:r>
           </w:p>
         </w:tc>
@@ -1574,23 +1528,7 @@
           <w:rFonts w:ascii="Arial" w:hAnsi="Arial" w:cs="Arial"/>
           <w:sz w:val="20"/>
         </w:rPr>
-        <w:t xml:space="preserve">We trust this meets with your </w:t>
-      </w:r>
-      <w:proofErr w:type="gramStart"/>
-      <w:r>
-        <w:rPr>
-          <w:rFonts w:ascii="Arial" w:hAnsi="Arial" w:cs="Arial"/>
-          <w:sz w:val="20"/>
-        </w:rPr>
-        <w:t>approval</w:t>
-      </w:r>
-      <w:proofErr w:type="gramEnd"/>
-      <w:r>
-        <w:rPr>
-          <w:rFonts w:ascii="Arial" w:hAnsi="Arial" w:cs="Arial"/>
-          <w:sz w:val="20"/>
-        </w:rPr>
-        <w:t xml:space="preserve"> however, should you have any further questions relating to this matter, please contact the undersigned.</w:t>
+        <w:t>We trust this meets with your approval however, should you have any further questions relating to this matter, please contact the undersigned.</w:t>
       </w:r>
     </w:p>
     <w:p>
@@ -5514,30 +5452,6 @@
 </file>
 
 <file path=customXml/item1.xml><?xml version="1.0" encoding="utf-8"?>
-<?mso-contentType ?>
-<FormTemplates xmlns="http://schemas.microsoft.com/sharepoint/v3/contenttype/forms">
-  <Display>DocumentLibraryForm</Display>
-  <Edit>DocumentLibraryForm</Edit>
-  <New>DocumentLibraryForm</New>
-</FormTemplates>
-</file>
-
-<file path=customXml/item2.xml><?xml version="1.0" encoding="utf-8"?>
-<p:properties xmlns:p="http://schemas.microsoft.com/office/2006/metadata/properties" xmlns:xsi="http://www.w3.org/2001/XMLSchema-instance" xmlns:pc="http://schemas.microsoft.com/office/infopath/2007/PartnerControls">
-  <documentManagement>
-    <TaxCatchAll xmlns="e9608bb6-6640-4051-b95e-8f78ffdbbd5b"/>
-    <lcf76f155ced4ddcb4097134ff3c332f xmlns="98526936-f77e-49c8-adcf-636bf1db471d">
-      <Terms xmlns="http://schemas.microsoft.com/office/infopath/2007/PartnerControls"/>
-    </lcf76f155ced4ddcb4097134ff3c332f>
-  </documentManagement>
-</p:properties>
-</file>
-
-<file path=customXml/item3.xml><?xml version="1.0" encoding="utf-8"?>
-<LongProperties xmlns="http://schemas.microsoft.com/office/2006/metadata/longProperties"/>
-</file>
-
-<file path=customXml/item4.xml><?xml version="1.0" encoding="utf-8"?>
 <ct:contentTypeSchema xmlns:ct="http://schemas.microsoft.com/office/2006/metadata/contentType" xmlns:ma="http://schemas.microsoft.com/office/2006/metadata/properties/metaAttributes" ct:_="" ma:_="" ma:contentTypeName="Document" ma:contentTypeID="0x01010003415AEB564D25469BCB23A3245FEB57" ma:contentTypeVersion="13" ma:contentTypeDescription="Create a new document." ma:contentTypeScope="" ma:versionID="77687212b94813cc132c38468ea9addb">
   <xsd:schema xmlns:xsd="http://www.w3.org/2001/XMLSchema" xmlns:xs="http://www.w3.org/2001/XMLSchema" xmlns:p="http://schemas.microsoft.com/office/2006/metadata/properties" xmlns:ns2="98526936-f77e-49c8-adcf-636bf1db471d" xmlns:ns3="e9608bb6-6640-4051-b95e-8f78ffdbbd5b" targetNamespace="http://schemas.microsoft.com/office/2006/metadata/properties" ma:root="true" ma:fieldsID="ea30abb0c08670c9ce9ebccd1977a0f4" ns2:_="" ns3:_="">
     <xsd:import namespace="98526936-f77e-49c8-adcf-636bf1db471d"/>
@@ -5744,34 +5658,31 @@
 </ct:contentTypeSchema>
 </file>
 
-<file path=customXml/itemProps1.xml><?xml version="1.0" encoding="utf-8"?>
-<ds:datastoreItem xmlns:ds="http://schemas.openxmlformats.org/officeDocument/2006/customXml" ds:itemID="{A12CF83B-718A-46AF-BBA1-D87269DC8AE7}">
-  <ds:schemaRefs>
-    <ds:schemaRef ds:uri="http://schemas.microsoft.com/sharepoint/v3/contenttype/forms"/>
-  </ds:schemaRefs>
-</ds:datastoreItem>
+<file path=customXml/item2.xml><?xml version="1.0" encoding="utf-8"?>
+<LongProperties xmlns="http://schemas.microsoft.com/office/2006/metadata/longProperties"/>
 </file>
 
-<file path=customXml/itemProps2.xml><?xml version="1.0" encoding="utf-8"?>
-<ds:datastoreItem xmlns:ds="http://schemas.openxmlformats.org/officeDocument/2006/customXml" ds:itemID="{ED0DB590-B955-4089-A5B2-7E27830B7846}">
-  <ds:schemaRefs>
-    <ds:schemaRef ds:uri="http://schemas.microsoft.com/office/2006/metadata/properties"/>
-    <ds:schemaRef ds:uri="http://schemas.microsoft.com/office/infopath/2007/PartnerControls"/>
-    <ds:schemaRef ds:uri="e9608bb6-6640-4051-b95e-8f78ffdbbd5b"/>
-    <ds:schemaRef ds:uri="98526936-f77e-49c8-adcf-636bf1db471d"/>
-  </ds:schemaRefs>
-</ds:datastoreItem>
+<file path=customXml/item3.xml><?xml version="1.0" encoding="utf-8"?>
+<p:properties xmlns:p="http://schemas.microsoft.com/office/2006/metadata/properties" xmlns:xsi="http://www.w3.org/2001/XMLSchema-instance" xmlns:pc="http://schemas.microsoft.com/office/infopath/2007/PartnerControls">
+  <documentManagement>
+    <TaxCatchAll xmlns="e9608bb6-6640-4051-b95e-8f78ffdbbd5b"/>
+    <lcf76f155ced4ddcb4097134ff3c332f xmlns="98526936-f77e-49c8-adcf-636bf1db471d">
+      <Terms xmlns="http://schemas.microsoft.com/office/infopath/2007/PartnerControls"/>
+    </lcf76f155ced4ddcb4097134ff3c332f>
+  </documentManagement>
+</p:properties>
 </file>
 
-<file path=customXml/itemProps3.xml><?xml version="1.0" encoding="utf-8"?>
-<ds:datastoreItem xmlns:ds="http://schemas.openxmlformats.org/officeDocument/2006/customXml" ds:itemID="{1F352ACA-9FAA-4FCE-9AA7-46DE57490ECD}">
-  <ds:schemaRefs>
-    <ds:schemaRef ds:uri="http://schemas.microsoft.com/office/2006/metadata/longProperties"/>
-  </ds:schemaRefs>
-</ds:datastoreItem>
+<file path=customXml/item4.xml><?xml version="1.0" encoding="utf-8"?>
+<?mso-contentType ?>
+<FormTemplates xmlns="http://schemas.microsoft.com/sharepoint/v3/contenttype/forms">
+  <Display>DocumentLibraryForm</Display>
+  <Edit>DocumentLibraryForm</Edit>
+  <New>DocumentLibraryForm</New>
+</FormTemplates>
 </file>
 
-<file path=customXml/itemProps4.xml><?xml version="1.0" encoding="utf-8"?>
+<file path=customXml/itemProps1.xml><?xml version="1.0" encoding="utf-8"?>
 <ds:datastoreItem xmlns:ds="http://schemas.openxmlformats.org/officeDocument/2006/customXml" ds:itemID="{830E0DA1-6744-4C7C-82FF-195982BE520F}">
   <ds:schemaRefs>
     <ds:schemaRef ds:uri="http://schemas.microsoft.com/office/2006/metadata/contentType"/>
@@ -5788,4 +5699,31 @@
     <ds:schemaRef ds:uri="http://schemas.microsoft.com/internal/obd"/>
   </ds:schemaRefs>
 </ds:datastoreItem>
+</file>
+
+<file path=customXml/itemProps2.xml><?xml version="1.0" encoding="utf-8"?>
+<ds:datastoreItem xmlns:ds="http://schemas.openxmlformats.org/officeDocument/2006/customXml" ds:itemID="{1F352ACA-9FAA-4FCE-9AA7-46DE57490ECD}">
+  <ds:schemaRefs>
+    <ds:schemaRef ds:uri="http://schemas.microsoft.com/office/2006/metadata/longProperties"/>
+  </ds:schemaRefs>
+</ds:datastoreItem>
+</file>
+
+<file path=customXml/itemProps3.xml><?xml version="1.0" encoding="utf-8"?>
+<ds:datastoreItem xmlns:ds="http://schemas.openxmlformats.org/officeDocument/2006/customXml" ds:itemID="{ED0DB590-B955-4089-A5B2-7E27830B7846}">
+  <ds:schemaRefs>
+    <ds:schemaRef ds:uri="http://schemas.microsoft.com/office/2006/metadata/properties"/>
+    <ds:schemaRef ds:uri="http://schemas.microsoft.com/office/infopath/2007/PartnerControls"/>
+    <ds:schemaRef ds:uri="e9608bb6-6640-4051-b95e-8f78ffdbbd5b"/>
+    <ds:schemaRef ds:uri="98526936-f77e-49c8-adcf-636bf1db471d"/>
+  </ds:schemaRefs>
+</ds:datastoreItem>
+</file>
+
+<file path=customXml/itemProps4.xml><?xml version="1.0" encoding="utf-8"?>
+<ds:datastoreItem xmlns:ds="http://schemas.openxmlformats.org/officeDocument/2006/customXml" ds:itemID="{A12CF83B-718A-46AF-BBA1-D87269DC8AE7}">
+  <ds:schemaRefs>
+    <ds:schemaRef ds:uri="http://schemas.microsoft.com/sharepoint/v3/contenttype/forms"/>
+  </ds:schemaRefs>
+</ds:datastoreItem>
 </file>
</xml_diff>